<commit_message>
Chapter 1 v4: lighter images for reliable display, add PDF copy
Co-Authored-By: Claude Opus 5.5 <noreply@anthropic.com>
Claude-Session: https://claude.ai/code/session_01Fs9sxkQKff1aY5vUgXjVD6
</commit_message>
<xml_diff>
--- a/第一章_载体解构_第四版.docx
+++ b/第一章_载体解构_第四版.docx
@@ -71,7 +71,7 @@
       <w:r>
         <w:drawing>
           <wp:inline distT="0" distB="0" distL="0" distR="0">
-            <wp:extent cx="5191125" cy="2609850"/>
+            <wp:extent cx="5191125" cy="2600325"/>
             <wp:effectExtent t="0" r="0" b="0" l="0"/>
             <wp:docPr id="1" name="f01_framework" descr="图 1-1  本章逻辑框架" title="图 1-1  本章逻辑框架"/>
             <wp:cNvGraphicFramePr>
@@ -96,7 +96,7 @@
                   <pic:spPr bwMode="auto">
                     <a:xfrm>
                       <a:off x="0" y="0"/>
-                      <a:ext cx="5191125" cy="2609850"/>
+                      <a:ext cx="5191125" cy="2600325"/>
                     </a:xfrm>
                     <a:prstGeom prst="rect">
                       <a:avLst/>
@@ -8213,7 +8213,7 @@
       <w:r>
         <w:drawing>
           <wp:inline distT="0" distB="0" distL="0" distR="0">
-            <wp:extent cx="5191125" cy="2609850"/>
+            <wp:extent cx="5191125" cy="2600325"/>
             <wp:effectExtent t="0" r="0" b="0" l="0"/>
             <wp:docPr id="12" name="f11_paths" descr="图 1-12  机械系统“微型化”的三条路径" title="图 1-12  机械系统“微型化”的三条路径"/>
             <wp:cNvGraphicFramePr>
@@ -8238,7 +8238,7 @@
                   <pic:spPr bwMode="auto">
                     <a:xfrm>
                       <a:off x="0" y="0"/>
-                      <a:ext cx="5191125" cy="2609850"/>
+                      <a:ext cx="5191125" cy="2600325"/>
                     </a:xfrm>
                     <a:prstGeom prst="rect">
                       <a:avLst/>
@@ -10072,7 +10072,7 @@
       <w:r>
         <w:drawing>
           <wp:inline distT="0" distB="0" distL="0" distR="0">
-            <wp:extent cx="5191125" cy="2066925"/>
+            <wp:extent cx="5191125" cy="2076450"/>
             <wp:effectExtent t="0" r="0" b="0" l="0"/>
             <wp:docPr id="17" name="f14_seats" descr="图 1-17  高度自动化汽车中的三种典型座椅布局" title="图 1-17  高度自动化汽车中的三种典型座椅布局"/>
             <wp:cNvGraphicFramePr>
@@ -10097,7 +10097,7 @@
                   <pic:spPr bwMode="auto">
                     <a:xfrm>
                       <a:off x="0" y="0"/>
-                      <a:ext cx="5191125" cy="2066925"/>
+                      <a:ext cx="5191125" cy="2076450"/>
                     </a:xfrm>
                     <a:prstGeom prst="rect">
                       <a:avLst/>

</xml_diff>